<commit_message>
Mengubah tabel database usulan perubahan dan menyederhanakan dashboard main, membuat semua dokumen bisa dihapus:
</commit_message>
<xml_diff>
--- a/templates/laporan_insiden_template.docx
+++ b/templates/laporan_insiden_template.docx
@@ -720,25 +720,13 @@
           <w:p>
             <w:pPr>
               <w:spacing w:line="360" w:lineRule="auto"/>
-              <w:rPr>
-                <w:sz w:val="24"/>
-                <w:szCs w:val="24"/>
-              </w:rPr>
             </w:pPr>
             <w:bookmarkStart w:id="1" w:name="_Hlk219797341"/>
             <w:r>
-              <w:rPr>
-                <w:sz w:val="24"/>
-                <w:szCs w:val="24"/>
-              </w:rPr>
               <w:t xml:space="preserve">No. </w:t>
             </w:r>
             <w:proofErr w:type="spellStart"/>
             <w:r>
-              <w:rPr>
-                <w:sz w:val="24"/>
-                <w:szCs w:val="24"/>
-              </w:rPr>
               <w:t>Permohonan</w:t>
             </w:r>
             <w:proofErr w:type="spellEnd"/>
@@ -757,16 +745,8 @@
           <w:p>
             <w:pPr>
               <w:spacing w:line="360" w:lineRule="auto"/>
-              <w:rPr>
-                <w:sz w:val="24"/>
-                <w:szCs w:val="24"/>
-              </w:rPr>
-            </w:pPr>
-            <w:r>
-              <w:rPr>
-                <w:sz w:val="24"/>
-                <w:szCs w:val="24"/>
-              </w:rPr>
+            </w:pPr>
+            <w:r>
               <w:t>:</w:t>
             </w:r>
           </w:p>
@@ -785,41 +765,21 @@
           <w:p>
             <w:pPr>
               <w:spacing w:line="360" w:lineRule="auto"/>
-              <w:rPr>
-                <w:sz w:val="24"/>
-                <w:szCs w:val="24"/>
-              </w:rPr>
-            </w:pPr>
-            <w:r>
-              <w:rPr>
-                <w:sz w:val="24"/>
-                <w:szCs w:val="24"/>
-              </w:rPr>
+            </w:pPr>
+            <w:r>
               <w:t>{{</w:t>
             </w:r>
             <w:proofErr w:type="spellStart"/>
             <w:r>
-              <w:rPr>
-                <w:sz w:val="24"/>
-                <w:szCs w:val="24"/>
-              </w:rPr>
               <w:t>no_permohonan</w:t>
             </w:r>
             <w:proofErr w:type="spellEnd"/>
             <w:proofErr w:type="gramStart"/>
             <w:r>
-              <w:rPr>
-                <w:sz w:val="24"/>
-                <w:szCs w:val="24"/>
-              </w:rPr>
               <w:t xml:space="preserve">}}   </w:t>
             </w:r>
             <w:proofErr w:type="gramEnd"/>
             <w:r>
-              <w:rPr>
-                <w:sz w:val="24"/>
-                <w:szCs w:val="24"/>
-              </w:rPr>
               <w:t xml:space="preserve">                                         </w:t>
             </w:r>
           </w:p>
@@ -845,17 +805,13 @@
               <w:rPr>
                 <w:b/>
                 <w:bCs/>
-                <w:sz w:val="24"/>
-                <w:szCs w:val="24"/>
-              </w:rPr>
-            </w:pPr>
-            <w:proofErr w:type="spellStart"/>
-            <w:r>
-              <w:rPr>
-                <w:b/>
-                <w:bCs/>
-                <w:sz w:val="24"/>
-                <w:szCs w:val="24"/>
+              </w:rPr>
+            </w:pPr>
+            <w:proofErr w:type="spellStart"/>
+            <w:r>
+              <w:rPr>
+                <w:b/>
+                <w:bCs/>
               </w:rPr>
               <w:t>Diisi</w:t>
             </w:r>
@@ -864,8 +820,6 @@
               <w:rPr>
                 <w:b/>
                 <w:bCs/>
-                <w:sz w:val="24"/>
-                <w:szCs w:val="24"/>
               </w:rPr>
               <w:t xml:space="preserve"> Oleh </w:t>
             </w:r>
@@ -874,8 +828,6 @@
               <w:rPr>
                 <w:b/>
                 <w:bCs/>
-                <w:sz w:val="24"/>
-                <w:szCs w:val="24"/>
               </w:rPr>
               <w:t>Pelapor</w:t>
             </w:r>
@@ -884,8 +836,6 @@
               <w:rPr>
                 <w:b/>
                 <w:bCs/>
-                <w:sz w:val="24"/>
-                <w:szCs w:val="24"/>
               </w:rPr>
               <w:tab/>
             </w:r>
@@ -904,73 +854,37 @@
           <w:p>
             <w:pPr>
               <w:spacing w:line="360" w:lineRule="auto"/>
-              <w:rPr>
-                <w:sz w:val="24"/>
-                <w:szCs w:val="24"/>
-              </w:rPr>
-            </w:pPr>
-          </w:p>
-          <w:p>
-            <w:pPr>
-              <w:spacing w:line="360" w:lineRule="auto"/>
-              <w:rPr>
-                <w:sz w:val="24"/>
-                <w:szCs w:val="24"/>
-              </w:rPr>
-            </w:pPr>
-            <w:r>
-              <w:rPr>
-                <w:sz w:val="24"/>
-                <w:szCs w:val="24"/>
-              </w:rPr>
+            </w:pPr>
+          </w:p>
+          <w:p>
+            <w:pPr>
+              <w:spacing w:line="360" w:lineRule="auto"/>
+            </w:pPr>
+            <w:r>
               <w:t>{{</w:t>
             </w:r>
             <w:proofErr w:type="spellStart"/>
             <w:r>
-              <w:rPr>
-                <w:sz w:val="24"/>
-                <w:szCs w:val="24"/>
-              </w:rPr>
               <w:t>tanggal_kejadian</w:t>
             </w:r>
             <w:proofErr w:type="spellEnd"/>
             <w:r>
-              <w:rPr>
-                <w:sz w:val="24"/>
-                <w:szCs w:val="24"/>
-              </w:rPr>
               <w:t>}}</w:t>
             </w:r>
           </w:p>
           <w:p>
             <w:pPr>
               <w:spacing w:line="360" w:lineRule="auto"/>
-              <w:rPr>
-                <w:sz w:val="24"/>
-                <w:szCs w:val="24"/>
-              </w:rPr>
-            </w:pPr>
-            <w:r>
-              <w:rPr>
-                <w:sz w:val="24"/>
-                <w:szCs w:val="24"/>
-              </w:rPr>
+            </w:pPr>
+            <w:r>
               <w:t>{{</w:t>
             </w:r>
             <w:proofErr w:type="spellStart"/>
             <w:r>
-              <w:rPr>
-                <w:sz w:val="24"/>
-                <w:szCs w:val="24"/>
-              </w:rPr>
               <w:t>nama_pelapor</w:t>
             </w:r>
             <w:proofErr w:type="spellEnd"/>
             <w:r>
-              <w:rPr>
-                <w:sz w:val="24"/>
-                <w:szCs w:val="24"/>
-              </w:rPr>
               <w:t xml:space="preserve">}}                                            </w:t>
             </w:r>
           </w:p>
@@ -978,15 +892,11 @@
             <w:pPr>
               <w:spacing w:line="360" w:lineRule="auto"/>
               <w:rPr>
-                <w:sz w:val="24"/>
-                <w:szCs w:val="24"/>
                 <w:lang w:val="sv-SE"/>
               </w:rPr>
             </w:pPr>
             <w:r>
               <w:rPr>
-                <w:sz w:val="24"/>
-                <w:szCs w:val="24"/>
                 <w:lang w:val="sv-SE"/>
               </w:rPr>
               <w:t xml:space="preserve">{{nama_bidang}}                                             </w:t>
@@ -998,41 +908,23 @@
               <w:rPr>
                 <w:b/>
                 <w:bCs/>
-                <w:sz w:val="24"/>
-                <w:szCs w:val="24"/>
                 <w:lang w:val="sv-SE"/>
               </w:rPr>
             </w:pPr>
             <w:r>
-              <w:rPr>
-                <w:sz w:val="24"/>
-                <w:szCs w:val="24"/>
-              </w:rPr>
               <w:t>{{</w:t>
             </w:r>
             <w:proofErr w:type="spellStart"/>
             <w:r>
-              <w:rPr>
-                <w:sz w:val="24"/>
-                <w:szCs w:val="24"/>
-              </w:rPr>
               <w:t>deskripsi_insiden</w:t>
             </w:r>
             <w:proofErr w:type="spellEnd"/>
             <w:proofErr w:type="gramStart"/>
             <w:r>
-              <w:rPr>
-                <w:sz w:val="24"/>
-                <w:szCs w:val="24"/>
-              </w:rPr>
               <w:t xml:space="preserve">}}   </w:t>
             </w:r>
             <w:proofErr w:type="gramEnd"/>
             <w:r>
-              <w:rPr>
-                <w:sz w:val="24"/>
-                <w:szCs w:val="24"/>
-              </w:rPr>
               <w:t xml:space="preserve">                                    </w:t>
             </w:r>
           </w:p>
@@ -1052,33 +944,17 @@
           <w:p>
             <w:pPr>
               <w:spacing w:line="360" w:lineRule="auto"/>
-              <w:rPr>
-                <w:sz w:val="24"/>
-                <w:szCs w:val="24"/>
-              </w:rPr>
-            </w:pPr>
-            <w:proofErr w:type="spellStart"/>
-            <w:r>
-              <w:rPr>
-                <w:sz w:val="24"/>
-                <w:szCs w:val="24"/>
-              </w:rPr>
+            </w:pPr>
+            <w:proofErr w:type="spellStart"/>
+            <w:r>
               <w:t>Tanggal</w:t>
             </w:r>
             <w:proofErr w:type="spellEnd"/>
             <w:r>
-              <w:rPr>
-                <w:sz w:val="24"/>
-                <w:szCs w:val="24"/>
-              </w:rPr>
               <w:t xml:space="preserve"> </w:t>
             </w:r>
             <w:proofErr w:type="spellStart"/>
             <w:r>
-              <w:rPr>
-                <w:sz w:val="24"/>
-                <w:szCs w:val="24"/>
-              </w:rPr>
               <w:t>Kejadian</w:t>
             </w:r>
             <w:proofErr w:type="spellEnd"/>
@@ -1097,16 +973,8 @@
           <w:p>
             <w:pPr>
               <w:spacing w:line="360" w:lineRule="auto"/>
-              <w:rPr>
-                <w:sz w:val="24"/>
-                <w:szCs w:val="24"/>
-              </w:rPr>
-            </w:pPr>
-            <w:r>
-              <w:rPr>
-                <w:sz w:val="24"/>
-                <w:szCs w:val="24"/>
-              </w:rPr>
+            </w:pPr>
+            <w:r>
               <w:t>:</w:t>
             </w:r>
           </w:p>
@@ -1124,10 +992,6 @@
           <w:p>
             <w:pPr>
               <w:spacing w:line="360" w:lineRule="auto"/>
-              <w:rPr>
-                <w:sz w:val="24"/>
-                <w:szCs w:val="24"/>
-              </w:rPr>
             </w:pPr>
           </w:p>
         </w:tc>
@@ -1146,24 +1010,12 @@
           <w:p>
             <w:pPr>
               <w:spacing w:line="360" w:lineRule="auto"/>
-              <w:rPr>
-                <w:sz w:val="24"/>
-                <w:szCs w:val="24"/>
-              </w:rPr>
-            </w:pPr>
-            <w:r>
-              <w:rPr>
-                <w:sz w:val="24"/>
-                <w:szCs w:val="24"/>
-              </w:rPr>
+            </w:pPr>
+            <w:r>
               <w:t xml:space="preserve">Nama </w:t>
             </w:r>
             <w:proofErr w:type="spellStart"/>
             <w:r>
-              <w:rPr>
-                <w:sz w:val="24"/>
-                <w:szCs w:val="24"/>
-              </w:rPr>
               <w:t>Pelapor</w:t>
             </w:r>
             <w:proofErr w:type="spellEnd"/>
@@ -1182,16 +1034,8 @@
           <w:p>
             <w:pPr>
               <w:spacing w:line="360" w:lineRule="auto"/>
-              <w:rPr>
-                <w:sz w:val="24"/>
-                <w:szCs w:val="24"/>
-              </w:rPr>
-            </w:pPr>
-            <w:r>
-              <w:rPr>
-                <w:sz w:val="24"/>
-                <w:szCs w:val="24"/>
-              </w:rPr>
+            </w:pPr>
+            <w:r>
               <w:t>:</w:t>
             </w:r>
           </w:p>
@@ -1209,10 +1053,6 @@
           <w:p>
             <w:pPr>
               <w:spacing w:line="360" w:lineRule="auto"/>
-              <w:rPr>
-                <w:sz w:val="24"/>
-                <w:szCs w:val="24"/>
-              </w:rPr>
             </w:pPr>
           </w:p>
         </w:tc>
@@ -1231,24 +1071,12 @@
           <w:p>
             <w:pPr>
               <w:spacing w:line="360" w:lineRule="auto"/>
-              <w:rPr>
-                <w:sz w:val="24"/>
-                <w:szCs w:val="24"/>
-              </w:rPr>
-            </w:pPr>
-            <w:r>
-              <w:rPr>
-                <w:sz w:val="24"/>
-                <w:szCs w:val="24"/>
-              </w:rPr>
+            </w:pPr>
+            <w:r>
               <w:t xml:space="preserve">Nama </w:t>
             </w:r>
             <w:proofErr w:type="spellStart"/>
             <w:r>
-              <w:rPr>
-                <w:sz w:val="24"/>
-                <w:szCs w:val="24"/>
-              </w:rPr>
               <w:t>Bidang</w:t>
             </w:r>
             <w:proofErr w:type="spellEnd"/>
@@ -1267,16 +1095,8 @@
           <w:p>
             <w:pPr>
               <w:spacing w:line="360" w:lineRule="auto"/>
-              <w:rPr>
-                <w:sz w:val="24"/>
-                <w:szCs w:val="24"/>
-              </w:rPr>
-            </w:pPr>
-            <w:r>
-              <w:rPr>
-                <w:sz w:val="24"/>
-                <w:szCs w:val="24"/>
-              </w:rPr>
+            </w:pPr>
+            <w:r>
               <w:t>:</w:t>
             </w:r>
           </w:p>
@@ -1294,10 +1114,6 @@
           <w:p>
             <w:pPr>
               <w:spacing w:line="360" w:lineRule="auto"/>
-              <w:rPr>
-                <w:sz w:val="24"/>
-                <w:szCs w:val="24"/>
-              </w:rPr>
             </w:pPr>
           </w:p>
         </w:tc>
@@ -1316,33 +1132,17 @@
           <w:p>
             <w:pPr>
               <w:spacing w:line="360" w:lineRule="auto"/>
-              <w:rPr>
-                <w:sz w:val="24"/>
-                <w:szCs w:val="24"/>
-              </w:rPr>
-            </w:pPr>
-            <w:proofErr w:type="spellStart"/>
-            <w:r>
-              <w:rPr>
-                <w:sz w:val="24"/>
-                <w:szCs w:val="24"/>
-              </w:rPr>
+            </w:pPr>
+            <w:proofErr w:type="spellStart"/>
+            <w:r>
               <w:t>Deskripsi</w:t>
             </w:r>
             <w:proofErr w:type="spellEnd"/>
             <w:r>
-              <w:rPr>
-                <w:sz w:val="24"/>
-                <w:szCs w:val="24"/>
-              </w:rPr>
               <w:t xml:space="preserve"> </w:t>
             </w:r>
             <w:proofErr w:type="spellStart"/>
             <w:r>
-              <w:rPr>
-                <w:sz w:val="24"/>
-                <w:szCs w:val="24"/>
-              </w:rPr>
               <w:t>insiden</w:t>
             </w:r>
             <w:proofErr w:type="spellEnd"/>
@@ -1361,16 +1161,8 @@
           <w:p>
             <w:pPr>
               <w:spacing w:line="360" w:lineRule="auto"/>
-              <w:rPr>
-                <w:sz w:val="24"/>
-                <w:szCs w:val="24"/>
-              </w:rPr>
-            </w:pPr>
-            <w:r>
-              <w:rPr>
-                <w:sz w:val="24"/>
-                <w:szCs w:val="24"/>
-              </w:rPr>
+            </w:pPr>
+            <w:r>
               <w:t>:</w:t>
             </w:r>
           </w:p>
@@ -1388,10 +1180,6 @@
           <w:p>
             <w:pPr>
               <w:spacing w:line="360" w:lineRule="auto"/>
-              <w:rPr>
-                <w:sz w:val="24"/>
-                <w:szCs w:val="24"/>
-              </w:rPr>
             </w:pPr>
           </w:p>
         </w:tc>
@@ -1413,17 +1201,9 @@
             <w:pPr>
               <w:spacing w:line="360" w:lineRule="auto"/>
               <w:jc w:val="center"/>
-              <w:rPr>
-                <w:sz w:val="24"/>
-                <w:szCs w:val="24"/>
-              </w:rPr>
-            </w:pPr>
-            <w:proofErr w:type="spellStart"/>
-            <w:r>
-              <w:rPr>
-                <w:sz w:val="24"/>
-                <w:szCs w:val="24"/>
-              </w:rPr>
+            </w:pPr>
+            <w:proofErr w:type="spellStart"/>
+            <w:r>
               <w:t>Pelapor</w:t>
             </w:r>
             <w:proofErr w:type="spellEnd"/>
@@ -1432,32 +1212,16 @@
             <w:pPr>
               <w:spacing w:line="360" w:lineRule="auto"/>
               <w:jc w:val="center"/>
-              <w:rPr>
-                <w:sz w:val="24"/>
-                <w:szCs w:val="24"/>
-              </w:rPr>
-            </w:pPr>
-            <w:r>
-              <w:rPr>
-                <w:sz w:val="24"/>
-                <w:szCs w:val="24"/>
-              </w:rPr>
+            </w:pPr>
+            <w:r>
               <w:t>{{</w:t>
             </w:r>
             <w:proofErr w:type="spellStart"/>
             <w:r>
-              <w:rPr>
-                <w:sz w:val="24"/>
-                <w:szCs w:val="24"/>
-              </w:rPr>
               <w:t>ttd_pelapor_image</w:t>
             </w:r>
             <w:proofErr w:type="spellEnd"/>
             <w:r>
-              <w:rPr>
-                <w:sz w:val="24"/>
-                <w:szCs w:val="24"/>
-              </w:rPr>
               <w:t xml:space="preserve">}}                                      </w:t>
             </w:r>
           </w:p>
@@ -1465,41 +1229,21 @@
             <w:pPr>
               <w:spacing w:line="360" w:lineRule="auto"/>
               <w:jc w:val="center"/>
-              <w:rPr>
-                <w:sz w:val="24"/>
-                <w:szCs w:val="24"/>
-              </w:rPr>
-            </w:pPr>
-            <w:r>
-              <w:rPr>
-                <w:sz w:val="24"/>
-                <w:szCs w:val="24"/>
-              </w:rPr>
+            </w:pPr>
+            <w:r>
               <w:t>{{</w:t>
             </w:r>
             <w:proofErr w:type="spellStart"/>
             <w:r>
-              <w:rPr>
-                <w:sz w:val="24"/>
-                <w:szCs w:val="24"/>
-              </w:rPr>
               <w:t>nama_ttd_pelapor</w:t>
             </w:r>
             <w:proofErr w:type="spellEnd"/>
             <w:proofErr w:type="gramStart"/>
             <w:r>
-              <w:rPr>
-                <w:sz w:val="24"/>
-                <w:szCs w:val="24"/>
-              </w:rPr>
               <w:t xml:space="preserve">}}   </w:t>
             </w:r>
             <w:proofErr w:type="gramEnd"/>
             <w:r>
-              <w:rPr>
-                <w:sz w:val="24"/>
-                <w:szCs w:val="24"/>
-              </w:rPr>
               <w:t xml:space="preserve">                                    </w:t>
             </w:r>
           </w:p>
@@ -1517,33 +1261,17 @@
             <w:pPr>
               <w:spacing w:line="360" w:lineRule="auto"/>
               <w:jc w:val="center"/>
-              <w:rPr>
-                <w:sz w:val="24"/>
-                <w:szCs w:val="24"/>
-              </w:rPr>
-            </w:pPr>
-            <w:proofErr w:type="spellStart"/>
-            <w:r>
-              <w:rPr>
-                <w:sz w:val="24"/>
-                <w:szCs w:val="24"/>
-              </w:rPr>
+            </w:pPr>
+            <w:proofErr w:type="spellStart"/>
+            <w:r>
               <w:t>Atasan</w:t>
             </w:r>
             <w:proofErr w:type="spellEnd"/>
             <w:r>
-              <w:rPr>
-                <w:sz w:val="24"/>
-                <w:szCs w:val="24"/>
-              </w:rPr>
               <w:t xml:space="preserve"> </w:t>
             </w:r>
             <w:proofErr w:type="spellStart"/>
             <w:r>
-              <w:rPr>
-                <w:sz w:val="24"/>
-                <w:szCs w:val="24"/>
-              </w:rPr>
               <w:t>Pelapor</w:t>
             </w:r>
             <w:proofErr w:type="spellEnd"/>
@@ -1552,32 +1280,16 @@
             <w:pPr>
               <w:spacing w:line="360" w:lineRule="auto"/>
               <w:jc w:val="center"/>
-              <w:rPr>
-                <w:sz w:val="24"/>
-                <w:szCs w:val="24"/>
-              </w:rPr>
-            </w:pPr>
-            <w:r>
-              <w:rPr>
-                <w:sz w:val="24"/>
-                <w:szCs w:val="24"/>
-              </w:rPr>
+            </w:pPr>
+            <w:r>
               <w:t>{{</w:t>
             </w:r>
             <w:proofErr w:type="spellStart"/>
             <w:r>
-              <w:rPr>
-                <w:sz w:val="24"/>
-                <w:szCs w:val="24"/>
-              </w:rPr>
               <w:t>ttd_atasan_image</w:t>
             </w:r>
             <w:proofErr w:type="spellEnd"/>
             <w:r>
-              <w:rPr>
-                <w:sz w:val="24"/>
-                <w:szCs w:val="24"/>
-              </w:rPr>
               <w:t xml:space="preserve">}}                                      </w:t>
             </w:r>
           </w:p>
@@ -1585,41 +1297,21 @@
             <w:pPr>
               <w:spacing w:line="360" w:lineRule="auto"/>
               <w:jc w:val="center"/>
-              <w:rPr>
-                <w:sz w:val="24"/>
-                <w:szCs w:val="24"/>
-              </w:rPr>
-            </w:pPr>
-            <w:r>
-              <w:rPr>
-                <w:sz w:val="24"/>
-                <w:szCs w:val="24"/>
-              </w:rPr>
+            </w:pPr>
+            <w:r>
               <w:t>{{</w:t>
             </w:r>
             <w:proofErr w:type="spellStart"/>
             <w:r>
-              <w:rPr>
-                <w:sz w:val="24"/>
-                <w:szCs w:val="24"/>
-              </w:rPr>
               <w:t>nama_ttd_atasan</w:t>
             </w:r>
             <w:proofErr w:type="spellEnd"/>
             <w:proofErr w:type="gramStart"/>
             <w:r>
-              <w:rPr>
-                <w:sz w:val="24"/>
-                <w:szCs w:val="24"/>
-              </w:rPr>
               <w:t xml:space="preserve">}}   </w:t>
             </w:r>
             <w:proofErr w:type="gramEnd"/>
             <w:r>
-              <w:rPr>
-                <w:sz w:val="24"/>
-                <w:szCs w:val="24"/>
-              </w:rPr>
               <w:t xml:space="preserve">                                    </w:t>
             </w:r>
           </w:p>
@@ -1642,17 +1334,13 @@
               <w:rPr>
                 <w:b/>
                 <w:bCs/>
-                <w:sz w:val="24"/>
-                <w:szCs w:val="24"/>
-              </w:rPr>
-            </w:pPr>
-            <w:proofErr w:type="spellStart"/>
-            <w:r>
-              <w:rPr>
-                <w:b/>
-                <w:bCs/>
-                <w:sz w:val="24"/>
-                <w:szCs w:val="24"/>
+              </w:rPr>
+            </w:pPr>
+            <w:proofErr w:type="spellStart"/>
+            <w:r>
+              <w:rPr>
+                <w:b/>
+                <w:bCs/>
               </w:rPr>
               <w:t>Diisi</w:t>
             </w:r>
@@ -1661,8 +1349,6 @@
               <w:rPr>
                 <w:b/>
                 <w:bCs/>
-                <w:sz w:val="24"/>
-                <w:szCs w:val="24"/>
               </w:rPr>
               <w:t xml:space="preserve"> Oleh SMKI Officer</w:t>
             </w:r>
@@ -1681,10 +1367,6 @@
           <w:p>
             <w:pPr>
               <w:spacing w:line="360" w:lineRule="auto"/>
-              <w:rPr>
-                <w:sz w:val="24"/>
-                <w:szCs w:val="24"/>
-              </w:rPr>
             </w:pPr>
           </w:p>
         </w:tc>
@@ -1702,10 +1384,6 @@
           <w:p>
             <w:pPr>
               <w:spacing w:line="360" w:lineRule="auto"/>
-              <w:rPr>
-                <w:sz w:val="24"/>
-                <w:szCs w:val="24"/>
-              </w:rPr>
             </w:pPr>
           </w:p>
         </w:tc>
@@ -1722,10 +1400,6 @@
           <w:p>
             <w:pPr>
               <w:spacing w:line="360" w:lineRule="auto"/>
-              <w:rPr>
-                <w:sz w:val="24"/>
-                <w:szCs w:val="24"/>
-              </w:rPr>
             </w:pPr>
           </w:p>
         </w:tc>
@@ -1744,32 +1418,16 @@
           <w:p>
             <w:pPr>
               <w:spacing w:line="360" w:lineRule="auto"/>
-              <w:rPr>
-                <w:sz w:val="24"/>
-                <w:szCs w:val="24"/>
-              </w:rPr>
-            </w:pPr>
-            <w:r>
-              <w:rPr>
-                <w:sz w:val="24"/>
-                <w:szCs w:val="24"/>
-              </w:rPr>
+            </w:pPr>
+            <w:r>
               <w:t xml:space="preserve">Jenis </w:t>
             </w:r>
             <w:proofErr w:type="spellStart"/>
             <w:r>
-              <w:rPr>
-                <w:sz w:val="24"/>
-                <w:szCs w:val="24"/>
-              </w:rPr>
               <w:t>Insiden</w:t>
             </w:r>
             <w:proofErr w:type="spellEnd"/>
             <w:r>
-              <w:rPr>
-                <w:sz w:val="24"/>
-                <w:szCs w:val="24"/>
-              </w:rPr>
               <w:t xml:space="preserve"> </w:t>
             </w:r>
           </w:p>
@@ -1787,16 +1445,8 @@
           <w:p>
             <w:pPr>
               <w:spacing w:line="360" w:lineRule="auto"/>
-              <w:rPr>
-                <w:sz w:val="24"/>
-                <w:szCs w:val="24"/>
-              </w:rPr>
-            </w:pPr>
-            <w:r>
-              <w:rPr>
-                <w:sz w:val="24"/>
-                <w:szCs w:val="24"/>
-              </w:rPr>
+            </w:pPr>
+            <w:r>
               <w:t>:</w:t>
             </w:r>
           </w:p>
@@ -1815,41 +1465,21 @@
           <w:p>
             <w:pPr>
               <w:spacing w:line="360" w:lineRule="auto"/>
-              <w:rPr>
-                <w:sz w:val="24"/>
-                <w:szCs w:val="24"/>
-              </w:rPr>
-            </w:pPr>
-            <w:r>
-              <w:rPr>
-                <w:sz w:val="24"/>
-                <w:szCs w:val="24"/>
-              </w:rPr>
+            </w:pPr>
+            <w:r>
               <w:t>{{</w:t>
             </w:r>
             <w:proofErr w:type="spellStart"/>
             <w:r>
-              <w:rPr>
-                <w:sz w:val="24"/>
-                <w:szCs w:val="24"/>
-              </w:rPr>
               <w:t>jenis_insiden</w:t>
             </w:r>
             <w:proofErr w:type="spellEnd"/>
             <w:proofErr w:type="gramStart"/>
             <w:r>
-              <w:rPr>
-                <w:sz w:val="24"/>
-                <w:szCs w:val="24"/>
-              </w:rPr>
               <w:t xml:space="preserve">}}   </w:t>
             </w:r>
             <w:proofErr w:type="gramEnd"/>
             <w:r>
-              <w:rPr>
-                <w:sz w:val="24"/>
-                <w:szCs w:val="24"/>
-              </w:rPr>
               <w:t xml:space="preserve">                    </w:t>
             </w:r>
           </w:p>
@@ -1867,10 +1497,6 @@
           <w:p>
             <w:pPr>
               <w:spacing w:line="360" w:lineRule="auto"/>
-              <w:rPr>
-                <w:sz w:val="24"/>
-                <w:szCs w:val="24"/>
-              </w:rPr>
             </w:pPr>
           </w:p>
         </w:tc>
@@ -1889,33 +1515,17 @@
           <w:p>
             <w:pPr>
               <w:spacing w:line="360" w:lineRule="auto"/>
-              <w:rPr>
-                <w:sz w:val="24"/>
-                <w:szCs w:val="24"/>
-              </w:rPr>
-            </w:pPr>
-            <w:proofErr w:type="spellStart"/>
-            <w:r>
-              <w:rPr>
-                <w:sz w:val="24"/>
-                <w:szCs w:val="24"/>
-              </w:rPr>
+            </w:pPr>
+            <w:proofErr w:type="spellStart"/>
+            <w:r>
               <w:t>Analisis</w:t>
             </w:r>
             <w:proofErr w:type="spellEnd"/>
             <w:r>
-              <w:rPr>
-                <w:sz w:val="24"/>
-                <w:szCs w:val="24"/>
-              </w:rPr>
               <w:t xml:space="preserve"> </w:t>
             </w:r>
             <w:proofErr w:type="spellStart"/>
             <w:r>
-              <w:rPr>
-                <w:sz w:val="24"/>
-                <w:szCs w:val="24"/>
-              </w:rPr>
               <w:t>Penyebab</w:t>
             </w:r>
             <w:proofErr w:type="spellEnd"/>
@@ -1934,16 +1544,8 @@
           <w:p>
             <w:pPr>
               <w:spacing w:line="360" w:lineRule="auto"/>
-              <w:rPr>
-                <w:sz w:val="24"/>
-                <w:szCs w:val="24"/>
-              </w:rPr>
-            </w:pPr>
-            <w:r>
-              <w:rPr>
-                <w:sz w:val="24"/>
-                <w:szCs w:val="24"/>
-              </w:rPr>
+            </w:pPr>
+            <w:r>
               <w:t>:</w:t>
             </w:r>
           </w:p>
@@ -1962,41 +1564,21 @@
           <w:p>
             <w:pPr>
               <w:spacing w:line="360" w:lineRule="auto"/>
-              <w:rPr>
-                <w:sz w:val="24"/>
-                <w:szCs w:val="24"/>
-              </w:rPr>
-            </w:pPr>
-            <w:r>
-              <w:rPr>
-                <w:sz w:val="24"/>
-                <w:szCs w:val="24"/>
-              </w:rPr>
+            </w:pPr>
+            <w:r>
               <w:t>{{</w:t>
             </w:r>
             <w:proofErr w:type="spellStart"/>
             <w:r>
-              <w:rPr>
-                <w:sz w:val="24"/>
-                <w:szCs w:val="24"/>
-              </w:rPr>
               <w:t>analisa_penyebab</w:t>
             </w:r>
             <w:proofErr w:type="spellEnd"/>
             <w:proofErr w:type="gramStart"/>
             <w:r>
-              <w:rPr>
-                <w:sz w:val="24"/>
-                <w:szCs w:val="24"/>
-              </w:rPr>
               <w:t xml:space="preserve">}}   </w:t>
             </w:r>
             <w:proofErr w:type="gramEnd"/>
             <w:r>
-              <w:rPr>
-                <w:sz w:val="24"/>
-                <w:szCs w:val="24"/>
-              </w:rPr>
               <w:t xml:space="preserve">                 </w:t>
             </w:r>
           </w:p>
@@ -2016,58 +1598,30 @@
           <w:p>
             <w:pPr>
               <w:spacing w:line="360" w:lineRule="auto"/>
-              <w:rPr>
-                <w:sz w:val="24"/>
-                <w:szCs w:val="24"/>
-              </w:rPr>
-            </w:pPr>
-            <w:proofErr w:type="spellStart"/>
-            <w:r>
-              <w:rPr>
-                <w:sz w:val="24"/>
-                <w:szCs w:val="24"/>
-              </w:rPr>
+            </w:pPr>
+            <w:proofErr w:type="spellStart"/>
+            <w:r>
               <w:t>Tindak</w:t>
             </w:r>
             <w:proofErr w:type="spellEnd"/>
             <w:r>
-              <w:rPr>
-                <w:sz w:val="24"/>
-                <w:szCs w:val="24"/>
-              </w:rPr>
               <w:t xml:space="preserve"> </w:t>
             </w:r>
             <w:proofErr w:type="spellStart"/>
             <w:r>
-              <w:rPr>
-                <w:sz w:val="24"/>
-                <w:szCs w:val="24"/>
-              </w:rPr>
               <w:t>lanjut</w:t>
             </w:r>
             <w:proofErr w:type="spellEnd"/>
             <w:r>
-              <w:rPr>
-                <w:sz w:val="24"/>
-                <w:szCs w:val="24"/>
-              </w:rPr>
               <w:t xml:space="preserve"> yang</w:t>
             </w:r>
           </w:p>
           <w:p>
             <w:pPr>
               <w:spacing w:line="360" w:lineRule="auto"/>
-              <w:rPr>
-                <w:sz w:val="24"/>
-                <w:szCs w:val="24"/>
-              </w:rPr>
-            </w:pPr>
-            <w:proofErr w:type="spellStart"/>
-            <w:r>
-              <w:rPr>
-                <w:sz w:val="24"/>
-                <w:szCs w:val="24"/>
-              </w:rPr>
+            </w:pPr>
+            <w:proofErr w:type="spellStart"/>
+            <w:r>
               <w:t>dilakukan</w:t>
             </w:r>
             <w:proofErr w:type="spellEnd"/>
@@ -2088,16 +1642,8 @@
             <w:pPr>
               <w:spacing w:line="360" w:lineRule="auto"/>
               <w:jc w:val="center"/>
-              <w:rPr>
-                <w:sz w:val="24"/>
-                <w:szCs w:val="24"/>
-              </w:rPr>
-            </w:pPr>
-            <w:r>
-              <w:rPr>
-                <w:sz w:val="24"/>
-                <w:szCs w:val="24"/>
-              </w:rPr>
+            </w:pPr>
+            <w:r>
               <w:t>:</w:t>
             </w:r>
           </w:p>
@@ -2117,41 +1663,21 @@
           <w:p>
             <w:pPr>
               <w:spacing w:line="360" w:lineRule="auto"/>
-              <w:rPr>
-                <w:sz w:val="24"/>
-                <w:szCs w:val="24"/>
-              </w:rPr>
-            </w:pPr>
-            <w:r>
-              <w:rPr>
-                <w:sz w:val="24"/>
-                <w:szCs w:val="24"/>
-              </w:rPr>
+            </w:pPr>
+            <w:r>
               <w:t>{{</w:t>
             </w:r>
             <w:proofErr w:type="spellStart"/>
             <w:r>
-              <w:rPr>
-                <w:sz w:val="24"/>
-                <w:szCs w:val="24"/>
-              </w:rPr>
               <w:t>tindak_smki</w:t>
             </w:r>
             <w:proofErr w:type="spellEnd"/>
             <w:proofErr w:type="gramStart"/>
             <w:r>
-              <w:rPr>
-                <w:sz w:val="24"/>
-                <w:szCs w:val="24"/>
-              </w:rPr>
               <w:t xml:space="preserve">}}   </w:t>
             </w:r>
             <w:proofErr w:type="gramEnd"/>
             <w:r>
-              <w:rPr>
-                <w:sz w:val="24"/>
-                <w:szCs w:val="24"/>
-              </w:rPr>
               <w:t xml:space="preserve">                      </w:t>
             </w:r>
           </w:p>
@@ -2169,10 +1695,6 @@
           <w:p>
             <w:pPr>
               <w:spacing w:line="360" w:lineRule="auto"/>
-              <w:rPr>
-                <w:sz w:val="24"/>
-                <w:szCs w:val="24"/>
-              </w:rPr>
             </w:pPr>
           </w:p>
         </w:tc>
@@ -2191,40 +1713,20 @@
           <w:p>
             <w:pPr>
               <w:spacing w:line="360" w:lineRule="auto"/>
-              <w:rPr>
-                <w:sz w:val="24"/>
-                <w:szCs w:val="24"/>
-              </w:rPr>
-            </w:pPr>
-            <w:r>
-              <w:rPr>
-                <w:sz w:val="24"/>
-                <w:szCs w:val="24"/>
-              </w:rPr>
+            </w:pPr>
+            <w:r>
               <w:t xml:space="preserve">PIC </w:t>
             </w:r>
             <w:proofErr w:type="spellStart"/>
             <w:r>
-              <w:rPr>
-                <w:sz w:val="24"/>
-                <w:szCs w:val="24"/>
-              </w:rPr>
               <w:t>Tindak</w:t>
             </w:r>
             <w:proofErr w:type="spellEnd"/>
             <w:r>
-              <w:rPr>
-                <w:sz w:val="24"/>
-                <w:szCs w:val="24"/>
-              </w:rPr>
               <w:t xml:space="preserve"> </w:t>
             </w:r>
             <w:proofErr w:type="spellStart"/>
             <w:r>
-              <w:rPr>
-                <w:sz w:val="24"/>
-                <w:szCs w:val="24"/>
-              </w:rPr>
               <w:t>Lanjut</w:t>
             </w:r>
             <w:proofErr w:type="spellEnd"/>
@@ -2242,16 +1744,8 @@
           <w:p>
             <w:pPr>
               <w:spacing w:line="360" w:lineRule="auto"/>
-              <w:rPr>
-                <w:sz w:val="24"/>
-                <w:szCs w:val="24"/>
-              </w:rPr>
-            </w:pPr>
-            <w:r>
-              <w:rPr>
-                <w:sz w:val="24"/>
-                <w:szCs w:val="24"/>
-              </w:rPr>
+            </w:pPr>
+            <w:r>
               <w:t>:</w:t>
             </w:r>
           </w:p>
@@ -2269,41 +1763,21 @@
           <w:p>
             <w:pPr>
               <w:spacing w:line="360" w:lineRule="auto"/>
-              <w:rPr>
-                <w:sz w:val="24"/>
-                <w:szCs w:val="24"/>
-              </w:rPr>
-            </w:pPr>
-            <w:r>
-              <w:rPr>
-                <w:sz w:val="24"/>
-                <w:szCs w:val="24"/>
-              </w:rPr>
+            </w:pPr>
+            <w:r>
               <w:t>{{</w:t>
             </w:r>
             <w:proofErr w:type="spellStart"/>
             <w:r>
-              <w:rPr>
-                <w:sz w:val="24"/>
-                <w:szCs w:val="24"/>
-              </w:rPr>
               <w:t>pic_tindak</w:t>
             </w:r>
             <w:proofErr w:type="spellEnd"/>
             <w:proofErr w:type="gramStart"/>
             <w:r>
-              <w:rPr>
-                <w:sz w:val="24"/>
-                <w:szCs w:val="24"/>
-              </w:rPr>
               <w:t xml:space="preserve">}}   </w:t>
             </w:r>
             <w:proofErr w:type="gramEnd"/>
             <w:r>
-              <w:rPr>
-                <w:sz w:val="24"/>
-                <w:szCs w:val="24"/>
-              </w:rPr>
               <w:t xml:space="preserve">                       </w:t>
             </w:r>
           </w:p>
@@ -2320,10 +1794,6 @@
           <w:p>
             <w:pPr>
               <w:spacing w:line="360" w:lineRule="auto"/>
-              <w:rPr>
-                <w:sz w:val="24"/>
-                <w:szCs w:val="24"/>
-              </w:rPr>
             </w:pPr>
           </w:p>
         </w:tc>
@@ -2345,16 +1815,8 @@
             <w:pPr>
               <w:spacing w:line="360" w:lineRule="auto"/>
               <w:jc w:val="center"/>
-              <w:rPr>
-                <w:sz w:val="24"/>
-                <w:szCs w:val="24"/>
-              </w:rPr>
-            </w:pPr>
-            <w:r>
-              <w:rPr>
-                <w:sz w:val="24"/>
-                <w:szCs w:val="24"/>
-              </w:rPr>
+            </w:pPr>
+            <w:r>
               <w:t>SMKI Officer</w:t>
             </w:r>
           </w:p>
@@ -2362,46 +1824,22 @@
             <w:pPr>
               <w:spacing w:line="360" w:lineRule="auto"/>
               <w:jc w:val="center"/>
-              <w:rPr>
-                <w:sz w:val="24"/>
-                <w:szCs w:val="24"/>
-              </w:rPr>
-            </w:pPr>
-            <w:r>
-              <w:rPr>
-                <w:sz w:val="24"/>
-                <w:szCs w:val="24"/>
-              </w:rPr>
+            </w:pPr>
+            <w:r>
               <w:t>{{</w:t>
             </w:r>
             <w:proofErr w:type="spellStart"/>
             <w:r>
-              <w:rPr>
-                <w:sz w:val="24"/>
-                <w:szCs w:val="24"/>
-              </w:rPr>
               <w:t>ttd_</w:t>
             </w:r>
             <w:r>
-              <w:rPr>
-                <w:sz w:val="24"/>
-                <w:szCs w:val="24"/>
-              </w:rPr>
               <w:t>smki</w:t>
             </w:r>
             <w:r>
-              <w:rPr>
-                <w:sz w:val="24"/>
-                <w:szCs w:val="24"/>
-              </w:rPr>
               <w:t>_image</w:t>
             </w:r>
             <w:proofErr w:type="spellEnd"/>
             <w:r>
-              <w:rPr>
-                <w:sz w:val="24"/>
-                <w:szCs w:val="24"/>
-              </w:rPr>
               <w:t xml:space="preserve">}}                                      </w:t>
             </w:r>
           </w:p>
@@ -2412,16 +1850,12 @@
               <w:rPr>
                 <w:b/>
                 <w:bCs/>
-                <w:sz w:val="24"/>
-                <w:szCs w:val="24"/>
-              </w:rPr>
-            </w:pPr>
-            <w:r>
-              <w:rPr>
-                <w:b/>
-                <w:bCs/>
-                <w:sz w:val="24"/>
-                <w:szCs w:val="24"/>
+              </w:rPr>
+            </w:pPr>
+            <w:r>
+              <w:rPr>
+                <w:b/>
+                <w:bCs/>
               </w:rPr>
               <w:t>{{</w:t>
             </w:r>
@@ -2430,8 +1864,6 @@
               <w:rPr>
                 <w:b/>
                 <w:bCs/>
-                <w:sz w:val="24"/>
-                <w:szCs w:val="24"/>
               </w:rPr>
               <w:t>nama_ttd_smki</w:t>
             </w:r>
@@ -2441,8 +1873,6 @@
               <w:rPr>
                 <w:b/>
                 <w:bCs/>
-                <w:sz w:val="24"/>
-                <w:szCs w:val="24"/>
               </w:rPr>
               <w:t xml:space="preserve">}}   </w:t>
             </w:r>
@@ -2451,8 +1881,6 @@
               <w:rPr>
                 <w:b/>
                 <w:bCs/>
-                <w:sz w:val="24"/>
-                <w:szCs w:val="24"/>
               </w:rPr>
               <w:t xml:space="preserve">                                    </w:t>
             </w:r>
@@ -2471,25 +1899,13 @@
             <w:pPr>
               <w:spacing w:line="360" w:lineRule="auto"/>
               <w:jc w:val="center"/>
-              <w:rPr>
-                <w:sz w:val="24"/>
-                <w:szCs w:val="24"/>
-              </w:rPr>
-            </w:pPr>
-            <w:proofErr w:type="spellStart"/>
-            <w:r>
-              <w:rPr>
-                <w:sz w:val="24"/>
-                <w:szCs w:val="24"/>
-              </w:rPr>
+            </w:pPr>
+            <w:proofErr w:type="spellStart"/>
+            <w:r>
               <w:t>Ketua</w:t>
             </w:r>
             <w:proofErr w:type="spellEnd"/>
             <w:r>
-              <w:rPr>
-                <w:sz w:val="24"/>
-                <w:szCs w:val="24"/>
-              </w:rPr>
               <w:t xml:space="preserve"> Tim IRKJ</w:t>
             </w:r>
           </w:p>
@@ -2497,46 +1913,22 @@
             <w:pPr>
               <w:spacing w:line="360" w:lineRule="auto"/>
               <w:jc w:val="center"/>
-              <w:rPr>
-                <w:sz w:val="24"/>
-                <w:szCs w:val="24"/>
-              </w:rPr>
-            </w:pPr>
-            <w:r>
-              <w:rPr>
-                <w:sz w:val="24"/>
-                <w:szCs w:val="24"/>
-              </w:rPr>
+            </w:pPr>
+            <w:r>
               <w:t>{{</w:t>
             </w:r>
             <w:proofErr w:type="spellStart"/>
             <w:r>
-              <w:rPr>
-                <w:sz w:val="24"/>
-                <w:szCs w:val="24"/>
-              </w:rPr>
               <w:t>ttd_</w:t>
             </w:r>
             <w:r>
-              <w:rPr>
-                <w:sz w:val="24"/>
-                <w:szCs w:val="24"/>
-              </w:rPr>
               <w:t>ketua</w:t>
             </w:r>
             <w:r>
-              <w:rPr>
-                <w:sz w:val="24"/>
-                <w:szCs w:val="24"/>
-              </w:rPr>
               <w:t>_image</w:t>
             </w:r>
             <w:proofErr w:type="spellEnd"/>
             <w:r>
-              <w:rPr>
-                <w:sz w:val="24"/>
-                <w:szCs w:val="24"/>
-              </w:rPr>
               <w:t xml:space="preserve">}}                    </w:t>
             </w:r>
           </w:p>
@@ -2547,16 +1939,12 @@
               <w:rPr>
                 <w:b/>
                 <w:bCs/>
-                <w:sz w:val="24"/>
-                <w:szCs w:val="24"/>
-              </w:rPr>
-            </w:pPr>
-            <w:r>
-              <w:rPr>
-                <w:b/>
-                <w:bCs/>
-                <w:sz w:val="24"/>
-                <w:szCs w:val="24"/>
+              </w:rPr>
+            </w:pPr>
+            <w:r>
+              <w:rPr>
+                <w:b/>
+                <w:bCs/>
               </w:rPr>
               <w:t>{{</w:t>
             </w:r>
@@ -2565,8 +1953,6 @@
               <w:rPr>
                 <w:b/>
                 <w:bCs/>
-                <w:sz w:val="24"/>
-                <w:szCs w:val="24"/>
               </w:rPr>
               <w:t>nama_ttd_ketua</w:t>
             </w:r>
@@ -2576,8 +1962,6 @@
               <w:rPr>
                 <w:b/>
                 <w:bCs/>
-                <w:sz w:val="24"/>
-                <w:szCs w:val="24"/>
               </w:rPr>
               <w:t xml:space="preserve">}}   </w:t>
             </w:r>
@@ -2586,8 +1970,6 @@
               <w:rPr>
                 <w:b/>
                 <w:bCs/>
-                <w:sz w:val="24"/>
-                <w:szCs w:val="24"/>
               </w:rPr>
               <w:t xml:space="preserve">                                    </w:t>
             </w:r>
@@ -2611,17 +1993,13 @@
               <w:rPr>
                 <w:b/>
                 <w:bCs/>
-                <w:sz w:val="24"/>
-                <w:szCs w:val="24"/>
-              </w:rPr>
-            </w:pPr>
-            <w:proofErr w:type="spellStart"/>
-            <w:r>
-              <w:rPr>
-                <w:b/>
-                <w:bCs/>
-                <w:sz w:val="24"/>
-                <w:szCs w:val="24"/>
+              </w:rPr>
+            </w:pPr>
+            <w:proofErr w:type="spellStart"/>
+            <w:r>
+              <w:rPr>
+                <w:b/>
+                <w:bCs/>
               </w:rPr>
               <w:t>Diisi</w:t>
             </w:r>
@@ -2630,8 +2008,6 @@
               <w:rPr>
                 <w:b/>
                 <w:bCs/>
-                <w:sz w:val="24"/>
-                <w:szCs w:val="24"/>
               </w:rPr>
               <w:t xml:space="preserve"> oleh </w:t>
             </w:r>
@@ -2640,8 +2016,6 @@
               <w:rPr>
                 <w:b/>
                 <w:bCs/>
-                <w:sz w:val="24"/>
-                <w:szCs w:val="24"/>
               </w:rPr>
               <w:t>Pihak</w:t>
             </w:r>
@@ -2650,8 +2024,6 @@
               <w:rPr>
                 <w:b/>
                 <w:bCs/>
-                <w:sz w:val="24"/>
-                <w:szCs w:val="24"/>
               </w:rPr>
               <w:t xml:space="preserve"> </w:t>
             </w:r>
@@ -2660,8 +2032,6 @@
               <w:rPr>
                 <w:b/>
                 <w:bCs/>
-                <w:sz w:val="24"/>
-                <w:szCs w:val="24"/>
               </w:rPr>
               <w:t>Terkait</w:t>
             </w:r>
@@ -2681,10 +2051,6 @@
           <w:p>
             <w:pPr>
               <w:spacing w:line="360" w:lineRule="auto"/>
-              <w:rPr>
-                <w:sz w:val="24"/>
-                <w:szCs w:val="24"/>
-              </w:rPr>
             </w:pPr>
           </w:p>
         </w:tc>
@@ -2702,10 +2068,6 @@
           <w:p>
             <w:pPr>
               <w:spacing w:line="360" w:lineRule="auto"/>
-              <w:rPr>
-                <w:sz w:val="24"/>
-                <w:szCs w:val="24"/>
-              </w:rPr>
             </w:pPr>
           </w:p>
         </w:tc>
@@ -2722,10 +2084,6 @@
           <w:p>
             <w:pPr>
               <w:spacing w:line="360" w:lineRule="auto"/>
-              <w:rPr>
-                <w:sz w:val="24"/>
-                <w:szCs w:val="24"/>
-              </w:rPr>
             </w:pPr>
           </w:p>
         </w:tc>
@@ -2745,15 +2103,11 @@
             <w:pPr>
               <w:spacing w:line="360" w:lineRule="auto"/>
               <w:rPr>
-                <w:sz w:val="24"/>
-                <w:szCs w:val="24"/>
                 <w:lang w:val="sv-SE"/>
               </w:rPr>
             </w:pPr>
             <w:r>
               <w:rPr>
-                <w:sz w:val="24"/>
-                <w:szCs w:val="24"/>
                 <w:lang w:val="sv-SE"/>
               </w:rPr>
               <w:t>Tindak lanjut yang di lakukan</w:t>
@@ -2776,15 +2130,11 @@
               <w:spacing w:line="360" w:lineRule="auto"/>
               <w:jc w:val="center"/>
               <w:rPr>
-                <w:sz w:val="24"/>
-                <w:szCs w:val="24"/>
                 <w:lang w:val="sv-SE"/>
               </w:rPr>
             </w:pPr>
             <w:r>
               <w:rPr>
-                <w:sz w:val="24"/>
-                <w:szCs w:val="24"/>
                 <w:lang w:val="sv-SE"/>
               </w:rPr>
               <w:t>:</w:t>
@@ -2807,41 +2157,23 @@
             <w:pPr>
               <w:spacing w:line="360" w:lineRule="auto"/>
               <w:rPr>
-                <w:sz w:val="24"/>
-                <w:szCs w:val="24"/>
                 <w:lang w:val="sv-SE"/>
               </w:rPr>
             </w:pPr>
             <w:r>
-              <w:rPr>
-                <w:sz w:val="24"/>
-                <w:szCs w:val="24"/>
-              </w:rPr>
               <w:t>{{</w:t>
             </w:r>
             <w:proofErr w:type="spellStart"/>
             <w:r>
-              <w:rPr>
-                <w:sz w:val="24"/>
-                <w:szCs w:val="24"/>
-              </w:rPr>
               <w:t>tindak_pihak</w:t>
             </w:r>
             <w:proofErr w:type="spellEnd"/>
             <w:proofErr w:type="gramStart"/>
             <w:r>
-              <w:rPr>
-                <w:sz w:val="24"/>
-                <w:szCs w:val="24"/>
-              </w:rPr>
               <w:t xml:space="preserve">}}   </w:t>
             </w:r>
             <w:proofErr w:type="gramEnd"/>
             <w:r>
-              <w:rPr>
-                <w:sz w:val="24"/>
-                <w:szCs w:val="24"/>
-              </w:rPr>
               <w:t xml:space="preserve">                     </w:t>
             </w:r>
           </w:p>
@@ -2860,8 +2192,6 @@
             <w:pPr>
               <w:spacing w:line="360" w:lineRule="auto"/>
               <w:rPr>
-                <w:sz w:val="24"/>
-                <w:szCs w:val="24"/>
                 <w:lang w:val="sv-SE"/>
               </w:rPr>
             </w:pPr>
@@ -2885,8 +2215,6 @@
               <w:rPr>
                 <w:b/>
                 <w:bCs/>
-                <w:sz w:val="24"/>
-                <w:szCs w:val="24"/>
                 <w:lang w:val="sv-SE"/>
               </w:rPr>
             </w:pPr>
@@ -2894,8 +2222,6 @@
               <w:rPr>
                 <w:b/>
                 <w:bCs/>
-                <w:sz w:val="24"/>
-                <w:szCs w:val="24"/>
                 <w:lang w:val="sv-SE"/>
               </w:rPr>
               <w:t>Diisi oleh SMKI Officer</w:t>
@@ -2916,8 +2242,6 @@
             <w:pPr>
               <w:spacing w:line="360" w:lineRule="auto"/>
               <w:rPr>
-                <w:sz w:val="24"/>
-                <w:szCs w:val="24"/>
                 <w:lang w:val="sv-SE"/>
               </w:rPr>
             </w:pPr>
@@ -2937,8 +2261,6 @@
             <w:pPr>
               <w:spacing w:line="360" w:lineRule="auto"/>
               <w:rPr>
-                <w:sz w:val="24"/>
-                <w:szCs w:val="24"/>
                 <w:lang w:val="sv-SE"/>
               </w:rPr>
             </w:pPr>
@@ -2947,15 +2269,11 @@
             <w:pPr>
               <w:spacing w:line="360" w:lineRule="auto"/>
               <w:rPr>
-                <w:sz w:val="24"/>
-                <w:szCs w:val="24"/>
                 <w:lang w:val="fi-FI"/>
               </w:rPr>
             </w:pPr>
             <w:r>
               <w:rPr>
-                <w:sz w:val="24"/>
-                <w:szCs w:val="24"/>
                 <w:lang w:val="fi-FI"/>
               </w:rPr>
               <w:t xml:space="preserve">{{insiden_selesai}}                                              </w:t>
@@ -2965,15 +2283,11 @@
             <w:pPr>
               <w:spacing w:line="360" w:lineRule="auto"/>
               <w:rPr>
-                <w:sz w:val="24"/>
-                <w:szCs w:val="24"/>
                 <w:lang w:val="sv-SE"/>
               </w:rPr>
             </w:pPr>
             <w:r>
               <w:rPr>
-                <w:sz w:val="24"/>
-                <w:szCs w:val="24"/>
                 <w:lang w:val="fi-FI"/>
               </w:rPr>
               <w:t xml:space="preserve">{{tanggal_penyelesaian}}                                       </w:t>
@@ -2996,15 +2310,11 @@
             <w:pPr>
               <w:spacing w:line="360" w:lineRule="auto"/>
               <w:rPr>
-                <w:sz w:val="24"/>
-                <w:szCs w:val="24"/>
                 <w:lang w:val="sv-SE"/>
               </w:rPr>
             </w:pPr>
             <w:r>
               <w:rPr>
-                <w:sz w:val="24"/>
-                <w:szCs w:val="24"/>
                 <w:lang w:val="sv-SE"/>
               </w:rPr>
               <w:t>Insiden Selesai</w:t>
@@ -3025,15 +2335,11 @@
             <w:pPr>
               <w:spacing w:line="360" w:lineRule="auto"/>
               <w:rPr>
-                <w:sz w:val="24"/>
-                <w:szCs w:val="24"/>
                 <w:lang w:val="sv-SE"/>
               </w:rPr>
             </w:pPr>
             <w:r>
               <w:rPr>
-                <w:sz w:val="24"/>
-                <w:szCs w:val="24"/>
                 <w:lang w:val="sv-SE"/>
               </w:rPr>
               <w:t>:</w:t>
@@ -3054,8 +2360,6 @@
             <w:pPr>
               <w:spacing w:line="360" w:lineRule="auto"/>
               <w:rPr>
-                <w:sz w:val="24"/>
-                <w:szCs w:val="24"/>
                 <w:lang w:val="sv-SE"/>
               </w:rPr>
             </w:pPr>
@@ -3077,15 +2381,11 @@
             <w:pPr>
               <w:spacing w:line="360" w:lineRule="auto"/>
               <w:rPr>
-                <w:sz w:val="24"/>
-                <w:szCs w:val="24"/>
                 <w:lang w:val="sv-SE"/>
               </w:rPr>
             </w:pPr>
             <w:r>
               <w:rPr>
-                <w:sz w:val="24"/>
-                <w:szCs w:val="24"/>
                 <w:lang w:val="sv-SE"/>
               </w:rPr>
               <w:t>Tanggal Penyelesaian</w:t>
@@ -3106,15 +2406,11 @@
             <w:pPr>
               <w:spacing w:line="360" w:lineRule="auto"/>
               <w:rPr>
-                <w:sz w:val="24"/>
-                <w:szCs w:val="24"/>
                 <w:lang w:val="sv-SE"/>
               </w:rPr>
             </w:pPr>
             <w:r>
               <w:rPr>
-                <w:sz w:val="24"/>
-                <w:szCs w:val="24"/>
                 <w:lang w:val="sv-SE"/>
               </w:rPr>
               <w:t>:</w:t>
@@ -3136,8 +2432,6 @@
             <w:pPr>
               <w:spacing w:line="360" w:lineRule="auto"/>
               <w:rPr>
-                <w:sz w:val="24"/>
-                <w:szCs w:val="24"/>
                 <w:lang w:val="sv-SE"/>
               </w:rPr>
             </w:pPr>
@@ -3162,16 +2456,8 @@
             <w:pPr>
               <w:spacing w:line="360" w:lineRule="auto"/>
               <w:jc w:val="center"/>
-              <w:rPr>
-                <w:sz w:val="24"/>
-                <w:szCs w:val="24"/>
-              </w:rPr>
-            </w:pPr>
-            <w:r>
-              <w:rPr>
-                <w:sz w:val="24"/>
-                <w:szCs w:val="24"/>
-              </w:rPr>
+            </w:pPr>
+            <w:r>
               <w:t>SMKI Officer</w:t>
             </w:r>
           </w:p>
@@ -3179,16 +2465,8 @@
             <w:pPr>
               <w:spacing w:line="360" w:lineRule="auto"/>
               <w:jc w:val="center"/>
-              <w:rPr>
-                <w:sz w:val="24"/>
-                <w:szCs w:val="24"/>
-              </w:rPr>
-            </w:pPr>
-            <w:r>
-              <w:rPr>
-                <w:sz w:val="24"/>
-                <w:szCs w:val="24"/>
-              </w:rPr>
+            </w:pPr>
+            <w:r>
               <w:t xml:space="preserve">{{ttd_smki2_image}}                                                                                  </w:t>
             </w:r>
           </w:p>
@@ -3199,8 +2477,6 @@
               <w:rPr>
                 <w:b/>
                 <w:bCs/>
-                <w:sz w:val="24"/>
-                <w:szCs w:val="24"/>
                 <w:lang w:val="sv-SE"/>
               </w:rPr>
             </w:pPr>
@@ -3208,8 +2484,6 @@
               <w:rPr>
                 <w:b/>
                 <w:bCs/>
-                <w:sz w:val="24"/>
-                <w:szCs w:val="24"/>
               </w:rPr>
               <w:t>{{nama_ttd_smki2</w:t>
             </w:r>
@@ -3218,8 +2492,6 @@
               <w:rPr>
                 <w:b/>
                 <w:bCs/>
-                <w:sz w:val="24"/>
-                <w:szCs w:val="24"/>
               </w:rPr>
               <w:t xml:space="preserve">}}   </w:t>
             </w:r>
@@ -3228,8 +2500,6 @@
               <w:rPr>
                 <w:b/>
                 <w:bCs/>
-                <w:sz w:val="24"/>
-                <w:szCs w:val="24"/>
               </w:rPr>
               <w:t xml:space="preserve">                                                                                </w:t>
             </w:r>

</xml_diff>